<commit_message>
Add Arabic slides + cover pages; build tooling for bilingual deliverables
- docs/presentation/slides-ar.md: full Arabic (RTL) slide deck
- cover pages added to English report.md + slides.md (university/supervisor as
  fillable placeholders «...»; real student names)
- docs/_sanitize_for_pdf.py: maps math/arrow glyphs to ASCII so the Arabic PDF
  renders under Amiri (which lacks those glyphs); DOCX/PPTX keep originals
- Makefile `docs-ar` target; Amiri font used for Arabic PDFs (RTL, verified)
- built: slides-ar.pptx (editable), slides-ar.pdf (RTL, images, 0 missing glyphs);
  rebuilt English report/slides with covers

Arabic report (report-ar.md) translation in progress; its docx/pdf follow.

Co-Authored-By: Claude Opus 4.8 (1M context) <noreply@anthropic.com>
</commit_message>
<xml_diff>
--- a/docs/build/report.docx
+++ b/docs/build/report.docx
@@ -46,6 +46,28 @@
           <w:b/>
           <w:bCs/>
         </w:rPr>
+        <w:t xml:space="preserve">«University Name — Faculty of Engineering»</w:t>
+      </w:r>
+      <w:r>
+        <w:t xml:space="preserve"> </w:t>
+      </w:r>
+      <w:r>
+        <w:rPr>
+          <w:b/>
+          <w:bCs/>
+        </w:rPr>
+        <w:t xml:space="preserve">«Department / Program»</w:t>
+      </w:r>
+    </w:p>
+    <w:p>
+      <w:pPr>
+        <w:pStyle w:val="BodyText"/>
+      </w:pPr>
+      <w:r>
+        <w:rPr>
+          <w:b/>
+          <w:bCs/>
+        </w:rPr>
         <w:t xml:space="preserve">Research seminar report</w:t>
       </w:r>
     </w:p>
@@ -54,7 +76,7 @@
         <w:pStyle w:val="BodyText"/>
       </w:pPr>
       <w:r>
-        <w:t xml:space="preserve">Authors:</w:t>
+        <w:t xml:space="preserve">Students:</w:t>
       </w:r>
       <w:r>
         <w:t xml:space="preserve"> </w:t>
@@ -78,6 +100,38 @@
           <w:bCs/>
         </w:rPr>
         <w:t xml:space="preserve">Mohammad Zein Qabbani</w:t>
+      </w:r>
+      <w:r>
+        <w:t xml:space="preserve"> </w:t>
+      </w:r>
+      <w:r>
+        <w:t xml:space="preserve">Supervisor:</w:t>
+      </w:r>
+      <w:r>
+        <w:t xml:space="preserve"> </w:t>
+      </w:r>
+      <w:r>
+        <w:rPr>
+          <w:b/>
+          <w:bCs/>
+        </w:rPr>
+        <w:t xml:space="preserve">«Dr. Supervisor Name»</w:t>
+      </w:r>
+      <w:r>
+        <w:t xml:space="preserve"> </w:t>
+      </w:r>
+      <w:r>
+        <w:t xml:space="preserve">Academic year:</w:t>
+      </w:r>
+      <w:r>
+        <w:t xml:space="preserve"> </w:t>
+      </w:r>
+      <w:r>
+        <w:rPr>
+          <w:b/>
+          <w:bCs/>
+        </w:rPr>
+        <w:t xml:space="preserve">«2025–2026»</w:t>
       </w:r>
     </w:p>
     <w:p>

</xml_diff>